<commit_message>
docs(deploy): update API URL with correct suffix in deployment docs
</commit_message>
<xml_diff>
--- a/Tai_Lieu_He_Thong_Trien_Khai.docx
+++ b/Tai_Lieu_He_Thong_Trien_Khai.docx
@@ -1970,7 +1970,7 @@
                 <w:rFonts w:ascii="Arial" w:hAnsi="Arial"/>
                 <w:sz w:val="18"/>
               </w:rPr>
-              <w:t>https://medassist-production-3ab6.up.railway.app</w:t>
+              <w:t>https://medassist-production-3ab6.up.railway.app/api/v1</w:t>
             </w:r>
           </w:p>
         </w:tc>
@@ -1993,7 +1993,7 @@
                 <w:rFonts w:ascii="Arial" w:hAnsi="Arial"/>
                 <w:sz w:val="18"/>
               </w:rPr>
-              <w:t>Trỏ API Frontend đến địa chỉ Backend đang chạy thực tế trên Railway</w:t>
+              <w:t>Trỏ API Frontend đến địa chỉ API Backend đang chạy thực tế trên Railway</w:t>
             </w:r>
           </w:p>
         </w:tc>

</xml_diff>